<commit_message>
Some spelling issues fixed
</commit_message>
<xml_diff>
--- a/Anleitung_TeamOps_Muhov_de.docx
+++ b/Anleitung_TeamOps_Muhov_de.docx
@@ -400,7 +400,17 @@
           <w:sz w:val="32"/>
           <w:szCs w:val="32"/>
         </w:rPr>
-        <w:t>Soll</w:t>
+        <w:t>S</w:t>
+      </w:r>
+      <w:r>
+        <w:rPr>
+          <w:rFonts w:cstheme="minorHAnsi"/>
+          <w:b/>
+          <w:bCs/>
+          <w:sz w:val="32"/>
+          <w:szCs w:val="32"/>
+        </w:rPr>
+        <w:t>OLL</w:t>
       </w:r>
       <w:r>
         <w:rPr>
@@ -899,6 +909,7 @@
           <w:rFonts w:cstheme="minorHAnsi"/>
           <w:sz w:val="32"/>
           <w:szCs w:val="32"/>
+          <w:lang w:val="bg-BG"/>
         </w:rPr>
       </w:pPr>
       <w:r>
@@ -925,15 +936,23 @@
           <w:sz w:val="32"/>
           <w:szCs w:val="32"/>
         </w:rPr>
-        <w:t xml:space="preserve"> übertragen werden.</w:t>
-      </w:r>
-    </w:p>
-    <w:p>
-      <w:pPr>
-        <w:pStyle w:val="Listenabsatz"/>
+        <w:t xml:space="preserve"> übertragen werde</w:t>
+      </w:r>
+      <w:r>
+        <w:rPr>
+          <w:rFonts w:cstheme="minorHAnsi"/>
+          <w:sz w:val="32"/>
+          <w:szCs w:val="32"/>
+          <w:lang w:val="bg-BG"/>
+        </w:rPr>
+        <w:t>n.</w:t>
+      </w:r>
+    </w:p>
+    <w:p>
+      <w:pPr>
         <w:numPr>
           <w:ilvl w:val="0"/>
-          <w:numId w:val="7"/>
+          <w:numId w:val="4"/>
         </w:numPr>
         <w:rPr>
           <w:rFonts w:cstheme="minorHAnsi"/>
@@ -946,6 +965,7 @@
           <w:rFonts w:cstheme="minorHAnsi"/>
           <w:sz w:val="32"/>
           <w:szCs w:val="32"/>
+          <w:lang w:val="bg-BG"/>
         </w:rPr>
         <w:t>Dies</w:t>
       </w:r>
@@ -963,8 +983,17 @@
           <w:rFonts w:cstheme="minorHAnsi"/>
           <w:sz w:val="32"/>
           <w:szCs w:val="32"/>
-        </w:rPr>
-        <w:t xml:space="preserve">führt nicht nur zu keinerlei neuen Kosten, sondern könnte sogar ein geeignetes </w:t>
+          <w:lang w:val="bg-BG"/>
+        </w:rPr>
+        <w:t>führt nicht</w:t>
+      </w:r>
+      <w:r>
+        <w:rPr>
+          <w:rFonts w:cstheme="minorHAnsi"/>
+          <w:sz w:val="32"/>
+          <w:szCs w:val="32"/>
+        </w:rPr>
+        <w:t xml:space="preserve"> nur zu keinerlei neuen Kosten, sondern könnte sogar ein geeignetes </w:t>
       </w:r>
       <w:r>
         <w:rPr>
@@ -1488,17 +1517,63 @@
           <w:szCs w:val="24"/>
         </w:rPr>
       </w:pPr>
-      <w:r>
-        <w:rPr>
+    </w:p>
+    <w:p>
+      <w:pPr>
+        <w:jc w:val="center"/>
+        <w:rPr>
+          <w:rFonts w:cstheme="minorHAnsi"/>
           <w:i/>
           <w:iCs/>
+          <w:sz w:val="24"/>
+          <w:szCs w:val="24"/>
+        </w:rPr>
+      </w:pPr>
+    </w:p>
+    <w:p>
+      <w:pPr>
+        <w:jc w:val="center"/>
+        <w:rPr>
+          <w:rFonts w:cstheme="minorHAnsi"/>
+          <w:i/>
+          <w:iCs/>
+          <w:sz w:val="24"/>
+          <w:szCs w:val="24"/>
+        </w:rPr>
+      </w:pPr>
+    </w:p>
+    <w:p>
+      <w:pPr>
+        <w:jc w:val="center"/>
+        <w:rPr>
+          <w:rFonts w:cstheme="minorHAnsi"/>
+          <w:i/>
+          <w:iCs/>
+          <w:sz w:val="24"/>
+          <w:szCs w:val="24"/>
+        </w:rPr>
+      </w:pPr>
+    </w:p>
+    <w:p>
+      <w:pPr>
+        <w:jc w:val="center"/>
+        <w:rPr>
+          <w:rFonts w:cstheme="minorHAnsi"/>
+          <w:i/>
+          <w:iCs/>
+          <w:sz w:val="24"/>
+          <w:szCs w:val="24"/>
+        </w:rPr>
+      </w:pPr>
+      <w:r>
+        <w:rPr>
           <w:noProof/>
           <w:sz w:val="18"/>
           <w:szCs w:val="18"/>
         </w:rPr>
         <w:lastRenderedPageBreak/>
         <w:drawing>
-          <wp:anchor distT="0" distB="0" distL="114300" distR="114300" simplePos="0" relativeHeight="251658240" behindDoc="0" locked="0" layoutInCell="1" allowOverlap="1" wp14:anchorId="6510B682" wp14:editId="4E720734">
+          <wp:anchor distT="0" distB="0" distL="114300" distR="114300" simplePos="0" relativeHeight="251658240" behindDoc="0" locked="0" layoutInCell="1" allowOverlap="1" wp14:anchorId="6510B682" wp14:editId="3C1D20DA">
             <wp:simplePos x="0" y="0"/>
             <wp:positionH relativeFrom="margin">
               <wp:align>center</wp:align>
@@ -1521,7 +1596,7 @@
                     <pic:cNvPicPr/>
                   </pic:nvPicPr>
                   <pic:blipFill>
-                    <a:blip r:embed="rId8">
+                    <a:blip r:embed="rId9">
                       <a:extLst>
                         <a:ext uri="{28A0092B-C50C-407E-A947-70E740481C1C}">
                           <a14:useLocalDpi xmlns:a14="http://schemas.microsoft.com/office/drawing/2010/main" val="0"/>
@@ -1582,7 +1657,7 @@
           <w:sz w:val="24"/>
           <w:szCs w:val="24"/>
         </w:rPr>
-        <w:t>A</w:t>
+        <w:t>Auf</w:t>
       </w:r>
       <w:r>
         <w:rPr>
@@ -1591,8 +1666,9 @@
           <w:iCs/>
           <w:sz w:val="24"/>
           <w:szCs w:val="24"/>
-        </w:rPr>
-        <w:t>u</w:t>
+          <w:lang w:val="bg-BG"/>
+        </w:rPr>
+        <w:t xml:space="preserve"> de</w:t>
       </w:r>
       <w:r>
         <w:rPr>
@@ -1601,9 +1677,8 @@
           <w:iCs/>
           <w:sz w:val="24"/>
           <w:szCs w:val="24"/>
-          <w:lang w:val="bg-BG"/>
-        </w:rPr>
-        <w:t>f de</w:t>
+        </w:rPr>
+        <w:t>m</w:t>
       </w:r>
       <w:r>
         <w:rPr>
@@ -1612,8 +1687,9 @@
           <w:iCs/>
           <w:sz w:val="24"/>
           <w:szCs w:val="24"/>
-        </w:rPr>
-        <w:t>m</w:t>
+          <w:lang w:val="bg-BG"/>
+        </w:rPr>
+        <w:t xml:space="preserve"> Bild ist das Beispiel-Blatt-Diagramm zu sehen. Beinhaltet 2</w:t>
       </w:r>
       <w:r>
         <w:rPr>
@@ -1622,9 +1698,8 @@
           <w:iCs/>
           <w:sz w:val="24"/>
           <w:szCs w:val="24"/>
-          <w:lang w:val="bg-BG"/>
-        </w:rPr>
-        <w:t xml:space="preserve"> Bild ist das Beispiel-Blatt-Diagramm zu sehen. Beinhaltet 2</w:t>
+        </w:rPr>
+        <w:t xml:space="preserve"> </w:t>
       </w:r>
       <w:r>
         <w:rPr>
@@ -1633,39 +1708,29 @@
           <w:iCs/>
           <w:sz w:val="24"/>
           <w:szCs w:val="24"/>
-        </w:rPr>
-        <w:t xml:space="preserve"> </w:t>
-      </w:r>
-      <w:r>
+          <w:lang w:val="bg-BG"/>
+        </w:rPr>
+        <w:t>Tabellen –</w:t>
+      </w:r>
+    </w:p>
+    <w:p>
+      <w:pPr>
+        <w:jc w:val="center"/>
         <w:rPr>
           <w:rFonts w:cstheme="minorHAnsi"/>
           <w:i/>
           <w:iCs/>
           <w:sz w:val="24"/>
           <w:szCs w:val="24"/>
-          <w:lang w:val="bg-BG"/>
-        </w:rPr>
-        <w:t>Tabellen –</w:t>
-      </w:r>
-    </w:p>
-    <w:p>
-      <w:pPr>
-        <w:jc w:val="center"/>
+        </w:rPr>
+      </w:pPr>
+      <w:r>
         <w:rPr>
           <w:rFonts w:cstheme="minorHAnsi"/>
           <w:i/>
           <w:iCs/>
           <w:sz w:val="24"/>
           <w:szCs w:val="24"/>
-        </w:rPr>
-      </w:pPr>
-      <w:r>
-        <w:rPr>
-          <w:rFonts w:cstheme="minorHAnsi"/>
-          <w:i/>
-          <w:iCs/>
-          <w:sz w:val="24"/>
-          <w:szCs w:val="24"/>
           <w:lang w:val="bg-BG"/>
         </w:rPr>
         <w:t xml:space="preserve"> Pro Woche und Pro Monat.</w:t>
@@ -1675,40 +1740,17 @@
       <w:pPr>
         <w:rPr>
           <w:rFonts w:cstheme="minorHAnsi"/>
-          <w:sz w:val="24"/>
-          <w:szCs w:val="24"/>
-        </w:rPr>
-      </w:pPr>
-    </w:p>
-    <w:p>
-      <w:r>
-        <w:rPr>
-          <w:rFonts w:cstheme="minorHAnsi"/>
-          <w:sz w:val="32"/>
-          <w:szCs w:val="32"/>
-          <w:lang w:val="bg-BG"/>
-        </w:rPr>
-        <w:t>Die Implementierung zusätzlicher Makros sowie die Anbindung an die interne Fehlerdatenbank von Siemens können im nächsten Schritt problemlos ergänzt werden.</w:t>
-      </w:r>
-      <w:r>
-        <w:t xml:space="preserve"> </w:t>
-      </w:r>
-    </w:p>
-    <w:p>
-      <w:pPr>
-        <w:rPr>
-          <w:rFonts w:cstheme="minorHAnsi"/>
-          <w:sz w:val="32"/>
-          <w:szCs w:val="32"/>
-        </w:rPr>
-      </w:pPr>
-      <w:r>
-        <w:rPr>
-          <w:rFonts w:cstheme="minorHAnsi"/>
-          <w:sz w:val="32"/>
-          <w:szCs w:val="32"/>
-        </w:rPr>
-        <w:t xml:space="preserve">Diese Aufgaben eignen sich zudem ideal als </w:t>
+          <w:sz w:val="32"/>
+          <w:szCs w:val="32"/>
+        </w:rPr>
+      </w:pPr>
+      <w:r>
+        <w:rPr>
+          <w:rFonts w:cstheme="minorHAnsi"/>
+          <w:sz w:val="32"/>
+          <w:szCs w:val="32"/>
+        </w:rPr>
+        <w:t xml:space="preserve">Lade die Excel-Datei </w:t>
       </w:r>
       <w:r>
         <w:rPr>
@@ -1718,54 +1760,91 @@
           <w:sz w:val="32"/>
           <w:szCs w:val="32"/>
         </w:rPr>
-        <w:t>Azubi-Projekt</w:t>
-      </w:r>
-      <w:r>
-        <w:rPr>
-          <w:rFonts w:cstheme="minorHAnsi"/>
-          <w:sz w:val="32"/>
-          <w:szCs w:val="32"/>
-        </w:rPr>
-        <w:t>, da ein Auszubildender sie vollständig und eigenständig umsetzen kann.</w:t>
-      </w:r>
-    </w:p>
-    <w:p>
-      <w:pPr>
-        <w:rPr>
-          <w:rFonts w:cstheme="minorHAnsi"/>
-          <w:sz w:val="32"/>
-          <w:szCs w:val="32"/>
-          <w:lang w:val="bg-BG"/>
-        </w:rPr>
-      </w:pPr>
-      <w:r>
-        <w:rPr>
-          <w:rFonts w:cstheme="minorHAnsi"/>
-          <w:sz w:val="32"/>
-          <w:szCs w:val="32"/>
-          <w:lang w:val="bg-BG"/>
-        </w:rPr>
-        <w:t xml:space="preserve">Dank dieser vorbereiteten Struktur lässt sich das Projekt ohne Zeitverlust aktivieren – und bietet gleichzeitig genug Flexibilität, um es </w:t>
-      </w:r>
-      <w:r>
-        <w:rPr>
-          <w:rFonts w:cstheme="minorHAnsi"/>
-          <w:sz w:val="32"/>
-          <w:szCs w:val="32"/>
-        </w:rPr>
-        <w:t>reibungslos</w:t>
-      </w:r>
-      <w:r>
-        <w:rPr>
-          <w:rFonts w:cstheme="minorHAnsi"/>
-          <w:sz w:val="32"/>
-          <w:szCs w:val="32"/>
-          <w:lang w:val="bg-BG"/>
-        </w:rPr>
-        <w:t xml:space="preserve"> in die bestehende Systemarchitektur zu integrieren.</w:t>
-      </w:r>
+        <w:t>Siemens_TeamOps_Muhov.xlsx</w:t>
+      </w:r>
+      <w:r>
+        <w:rPr>
+          <w:rFonts w:cstheme="minorHAnsi"/>
+          <w:sz w:val="32"/>
+          <w:szCs w:val="32"/>
+        </w:rPr>
+        <w:t xml:space="preserve"> herunter:</w:t>
+      </w:r>
+    </w:p>
+    <w:p>
+      <w:pPr>
+        <w:jc w:val="center"/>
+        <w:rPr>
+          <w:rStyle w:val="Hyperlink"/>
+          <w:sz w:val="32"/>
+          <w:szCs w:val="32"/>
+          <w:u w:val="none"/>
+        </w:rPr>
+      </w:pPr>
+      <w:hyperlink r:id="rId10" w:history="1">
+        <w:r>
+          <w:rPr>
+            <w:rStyle w:val="Hyperlink"/>
+            <w:sz w:val="32"/>
+            <w:szCs w:val="32"/>
+            <w:u w:val="none"/>
+          </w:rPr>
+          <w:t>https://github.com/georgimuhov/siemens</w:t>
+        </w:r>
+      </w:hyperlink>
+    </w:p>
+    <w:p>
+      <w:pPr>
+        <w:jc w:val="center"/>
+        <w:rPr>
+          <w:rStyle w:val="Hyperlink"/>
+          <w:sz w:val="32"/>
+          <w:szCs w:val="32"/>
+          <w:u w:val="none"/>
+        </w:rPr>
+      </w:pPr>
+      <w:r>
+        <w:rPr>
+          <w:rFonts w:cstheme="minorHAnsi"/>
+          <w:sz w:val="32"/>
+          <w:szCs w:val="32"/>
+        </w:rPr>
+        <w:t>oder</w:t>
+      </w:r>
+    </w:p>
+    <w:p>
+      <w:pPr>
+        <w:jc w:val="center"/>
+        <w:rPr>
+          <w:sz w:val="32"/>
+          <w:szCs w:val="32"/>
+        </w:rPr>
+      </w:pPr>
+      <w:hyperlink r:id="rId11" w:history="1">
+        <w:r>
+          <w:rPr>
+            <w:rStyle w:val="Hyperlink"/>
+            <w:rFonts w:cstheme="minorHAnsi"/>
+            <w:sz w:val="32"/>
+            <w:szCs w:val="32"/>
+            <w:u w:val="none"/>
+          </w:rPr>
+          <w:t>https://github.com/georgimuhov/siemens/raw/refs/heads/main/Siemens_TeamOps_Muhov.xlsx</w:t>
+        </w:r>
+      </w:hyperlink>
+    </w:p>
+    <w:p>
+      <w:pPr>
+        <w:rPr>
+          <w:rFonts w:cstheme="minorHAnsi"/>
+          <w:sz w:val="32"/>
+          <w:szCs w:val="32"/>
+          <w:lang w:val="bg-BG"/>
+        </w:rPr>
+      </w:pPr>
     </w:p>
     <w:sectPr>
+      <w:footerReference w:type="default" r:id="rId12"/>
       <w:pgSz w:w="11906" w:h="16838"/>
       <w:pgMar w:top="1417" w:right="1417" w:bottom="1417" w:left="1417" w:header="708" w:footer="708" w:gutter="0"/>
       <w:cols w:space="708"/>
@@ -1798,6 +1877,48 @@
     </w:p>
   </w:endnote>
 </w:endnotes>
+</file>
+
+<file path=word/footer1.xml><?xml version="1.0" encoding="utf-8"?>
+<w:ftr xmlns:wpc="http://schemas.microsoft.com/office/word/2010/wordprocessingCanvas" xmlns:cx="http://schemas.microsoft.com/office/drawing/2014/chartex" xmlns:cx1="http://schemas.microsoft.com/office/drawing/2015/9/8/chartex" xmlns:cx2="http://schemas.microsoft.com/office/drawing/2015/10/21/chartex" xmlns:cx3="http://schemas.microsoft.com/office/drawing/2016/5/9/chartex" xmlns:cx4="http://schemas.microsoft.com/office/drawing/2016/5/10/chartex" xmlns:cx5="http://schemas.microsoft.com/office/drawing/2016/5/11/chartex" xmlns:cx6="http://schemas.microsoft.com/office/drawing/2016/5/12/chartex" xmlns:cx7="http://schemas.microsoft.com/office/drawing/2016/5/13/chartex" xmlns:cx8="http://schemas.microsoft.com/office/drawing/2016/5/14/chartex" xmlns:mc="http://schemas.openxmlformats.org/markup-compatibility/2006" xmlns:aink="http://schemas.microsoft.com/office/drawing/2016/ink" xmlns:am3d="http://schemas.microsoft.com/office/drawing/2017/model3d" xmlns:o="urn:schemas-microsoft-com:office:office" xmlns:oel="http://schemas.microsoft.com/office/2019/extlst" xmlns:r="http://schemas.openxmlformats.org/officeDocument/2006/relationships" xmlns:m="http://schemas.openxmlformats.org/officeDocument/2006/math" xmlns:v="urn:schemas-microsoft-com:vml" xmlns:wp14="http://schemas.microsoft.com/office/word/2010/wordprocessingDrawing" xmlns:wp="http://schemas.openxmlformats.org/drawingml/2006/wordprocessingDrawing" xmlns:w10="urn:schemas-microsoft-com:office:word" xmlns:w="http://schemas.openxmlformats.org/wordprocessingml/2006/main" xmlns:w14="http://schemas.microsoft.com/office/word/2010/wordml" xmlns:w15="http://schemas.microsoft.com/office/word/2012/wordml" xmlns:w16cex="http://schemas.microsoft.com/office/word/2018/wordml/cex" xmlns:w16cid="http://schemas.microsoft.com/office/word/2016/wordml/cid" xmlns:w16="http://schemas.microsoft.com/office/word/2018/wordml" xmlns:w16du="http://schemas.microsoft.com/office/word/2023/wordml/word16du" xmlns:w16sdtdh="http://schemas.microsoft.com/office/word/2020/wordml/sdtdatahash" xmlns:w16sdtfl="http://schemas.microsoft.com/office/word/2024/wordml/sdtformatlock" xmlns:w16se="http://schemas.microsoft.com/office/word/2015/wordml/symex" xmlns:wpg="http://schemas.microsoft.com/office/word/2010/wordprocessingGroup" xmlns:wpi="http://schemas.microsoft.com/office/word/2010/wordprocessingInk" xmlns:wne="http://schemas.microsoft.com/office/word/2006/wordml" xmlns:wps="http://schemas.microsoft.com/office/word/2010/wordprocessingShape" mc:Ignorable="w14 w15 w16se w16cid w16 w16cex w16sdtdh w16sdtfl w16du wp14">
+  <w:sdt>
+    <w:sdtPr>
+      <w:id w:val="-1881852839"/>
+      <w:docPartObj>
+        <w:docPartGallery w:val="Page Numbers (Bottom of Page)"/>
+        <w:docPartUnique/>
+      </w:docPartObj>
+    </w:sdtPr>
+    <w:sdtContent>
+      <w:p>
+        <w:pPr>
+          <w:pStyle w:val="Fuzeile"/>
+          <w:jc w:val="center"/>
+        </w:pPr>
+        <w:r>
+          <w:fldChar w:fldCharType="begin"/>
+        </w:r>
+        <w:r>
+          <w:instrText>PAGE   \* MERGEFORMAT</w:instrText>
+        </w:r>
+        <w:r>
+          <w:fldChar w:fldCharType="separate"/>
+        </w:r>
+        <w:r>
+          <w:t>2</w:t>
+        </w:r>
+        <w:r>
+          <w:fldChar w:fldCharType="end"/>
+        </w:r>
+      </w:p>
+    </w:sdtContent>
+  </w:sdt>
+  <w:p>
+    <w:pPr>
+      <w:pStyle w:val="Fuzeile"/>
+    </w:pPr>
+  </w:p>
+</w:ftr>
 </file>
 
 <file path=word/footnotes.xml><?xml version="1.0" encoding="utf-8"?>
@@ -3390,6 +3511,7 @@
   <w:style w:type="character" w:default="1" w:styleId="Absatz-Standardschriftart">
     <w:name w:val="Default Paragraph Font"/>
     <w:uiPriority w:val="1"/>
+    <w:semiHidden/>
     <w:unhideWhenUsed/>
   </w:style>
   <w:style w:type="table" w:default="1" w:styleId="NormaleTabelle">
@@ -3747,6 +3869,29 @@
     <w:uiPriority w:val="99"/>
     <w:rsid w:val="005C41C0"/>
   </w:style>
+  <w:style w:type="character" w:styleId="Hyperlink">
+    <w:name w:val="Hyperlink"/>
+    <w:basedOn w:val="Absatz-Standardschriftart"/>
+    <w:uiPriority w:val="99"/>
+    <w:unhideWhenUsed/>
+    <w:rsid w:val="00C41DF1"/>
+    <w:rPr>
+      <w:color w:val="0563C1" w:themeColor="hyperlink"/>
+      <w:u w:val="single"/>
+    </w:rPr>
+  </w:style>
+  <w:style w:type="character" w:styleId="NichtaufgelsteErwhnung">
+    <w:name w:val="Unresolved Mention"/>
+    <w:basedOn w:val="Absatz-Standardschriftart"/>
+    <w:uiPriority w:val="99"/>
+    <w:semiHidden/>
+    <w:unhideWhenUsed/>
+    <w:rsid w:val="00C41DF1"/>
+    <w:rPr>
+      <w:color w:val="605E5C"/>
+      <w:shd w:val="clear" w:color="auto" w:fill="E1DFDD"/>
+    </w:rPr>
+  </w:style>
 </w:styles>
 </file>
 
@@ -4046,10 +4191,29 @@
 </file>
 
 <file path=customXml/item1.xml><?xml version="1.0" encoding="utf-8"?>
+<CoverPageProperties xmlns="http://schemas.microsoft.com/office/2006/coverPageProps">
+  <PublishDate/>
+  <Abstract/>
+  <CompanyAddress/>
+  <CompanyPhone/>
+  <CompanyFax/>
+  <CompanyEmail/>
+</CoverPageProperties>
+</file>
+
+<file path=customXml/item2.xml><?xml version="1.0" encoding="utf-8"?>
 <b:Sources xmlns:b="http://schemas.openxmlformats.org/officeDocument/2006/bibliography" xmlns="http://schemas.openxmlformats.org/officeDocument/2006/bibliography" SelectedStyle="\APASixthEditionOfficeOnline.xsl" StyleName="APA" Version="6"/>
 </file>
 
 <file path=customXml/itemProps1.xml><?xml version="1.0" encoding="utf-8"?>
+<ds:datastoreItem xmlns:ds="http://schemas.openxmlformats.org/officeDocument/2006/customXml" ds:itemID="{55AF091B-3C7A-41E3-B477-F2FDAA23CFDA}">
+  <ds:schemaRefs>
+    <ds:schemaRef ds:uri="http://schemas.microsoft.com/office/2006/coverPageProps"/>
+  </ds:schemaRefs>
+</ds:datastoreItem>
+</file>
+
+<file path=customXml/itemProps2.xml><?xml version="1.0" encoding="utf-8"?>
 <ds:datastoreItem xmlns:ds="http://schemas.openxmlformats.org/officeDocument/2006/customXml" ds:itemID="{DBAD1AAF-A851-496F-9B00-3F13F7350CA8}">
   <ds:schemaRefs>
     <ds:schemaRef ds:uri="http://schemas.openxmlformats.org/officeDocument/2006/bibliography"/>

</xml_diff>